<commit_message>
docs: Update all v4.0.0 documentation for KR Unified Language (.kr), 18 builds, and RoPE test
</commit_message>
<xml_diff>
--- a/docs/KR_Compiler_Android_Dokumentation_v4.0_15-10-2026.docx
+++ b/docs/KR_Compiler_Android_Dokumentation_v4.0_15-10-2026.docx
@@ -1798,6 +1798,11 @@
         <w:t>Alle 18 Zielkombinationen wurden auf dem Testgerät RMX3853 gebaut und geprüft. Windows- und Linux-Programme liefen mit übereinstimmenden Ausgaben. Android-APKs wurden über den Runner ausgeführt und getestet.</w:t>
       </w:r>
     </w:p>
+    <w:p>
+      <w:r>
+        <w:t>Zusätzlich wurde als rechenintensiver mathematischer Härtetest das Projekt KR_FUSION_RoPE_Attention (Rotary Position Embeddings und Online-Softmax Attention) in einer einzigen .kr-Datei mit C++-, Rust- und Go-Fusion erfolgreich gebaut und auf dem RMX3853 verifiziert (max_abs_error=1.66e-16).</w:t>
+      </w:r>
+    </w:p>
     <w:tbl>
       <w:tblPr>
         <w:tblW w:type="auto" w:w="0"/>

</xml_diff>